<commit_message>
docs: limpa resíduos de documentação apontados na 2ª auditoria
- etapa2_double_ml célula 0: índice do pipeline reescrito (removidos
  "instalação do EconML", "LinearDML/CausalForestDML", "θ por ano 2023/2024/2025");
  agora reflete DML manual, SE clusterizado, placebo dentro da temporada, IVB percentil.
- etapa2_modelagem_causal.md §5-8: substitui "métricas/testes planejados" e o
  cronograma obsoleto (que prometia CausalForestDML + PSM) pela descrição do que foi
  efetivamente executado; PSM/FBref/CausalForestDML movidos para limitações/trabalho futuro.
- script_apresentacao slide 3: "o mecanismo é de sinalização" -> "hipótese inicial /
  conjectura", removendo o overclaiming que o slide 10 depois rebaixa.
</commit_message>
<xml_diff>
--- a/docs/etapa2_modelagem_causal.docx
+++ b/docs/etapa2_modelagem_causal.docx
@@ -2,7 +2,7 @@
 <file path=word/document.xml><?xml version="1.0" encoding="utf-8"?>
 <w:document xmlns:w="http://schemas.openxmlformats.org/wordprocessingml/2006/main" xmlns:m="http://schemas.openxmlformats.org/officeDocument/2006/math" xmlns:r="http://schemas.openxmlformats.org/officeDocument/2006/relationships" xmlns:o="urn:schemas-microsoft-com:office:office" xmlns:v="urn:schemas-microsoft-com:vml" xmlns:w10="urn:schemas-microsoft-com:office:word" xmlns:a="http://schemas.openxmlformats.org/drawingml/2006/main" xmlns:pic="http://schemas.openxmlformats.org/drawingml/2006/picture" xmlns:wp="http://schemas.openxmlformats.org/drawingml/2006/wordprocessingDrawing">
   <w:body>
-    <w:bookmarkStart w:id="22" w:name="Xfe95c8ffe4262d995a7149745ea4053753ee821"/>
+    <w:bookmarkStart w:id="20" w:name="Xfe95c8ffe4262d995a7149745ea4053753ee821"/>
     <w:p>
       <w:pPr>
         <w:pStyle w:val="Heading1"/>
@@ -4330,13 +4330,22 @@
     </w:p>
     <w:bookmarkEnd w:id="13"/>
     <w:bookmarkEnd w:id="14"/>
-    <w:bookmarkStart w:id="18" w:name="métricas-inovadoras-adaptadas"/>
+    <w:bookmarkStart w:id="17" w:name="achado-central-e-heterogeneidade"/>
     <w:p>
       <w:pPr>
         <w:pStyle w:val="Heading2"/>
       </w:pPr>
       <w:r>
-        <w:t xml:space="preserve">5. Métricas inovadoras adaptadas</w:t>
+        <w:t xml:space="preserve">5. Achado central e heterogeneidade</w:t>
+      </w:r>
+    </w:p>
+    <w:bookmarkStart w:id="15" w:name="Xb42f3743889b03d493a5b4fdb54d2c2d0a98987"/>
+    <w:p>
+      <w:pPr>
+        <w:pStyle w:val="Heading3"/>
+      </w:pPr>
+      <w:r>
+        <w:t xml:space="preserve">5.1 Efeito médio (ATE) e o achado por temporada</w:t>
       </w:r>
     </w:p>
     <w:p>
@@ -4344,48 +4353,62 @@
         <w:pStyle w:val="FirstParagraph"/>
       </w:pPr>
       <w:r>
-        <w:t xml:space="preserve">A proposta original sugeria duas métricas: a Curva de Decaimento Temporal e</w:t>
-      </w:r>
-      <w:r>
-        <w:t xml:space="preserve"> </w:t>
-      </w:r>
-      <w:r>
-        <w:t xml:space="preserve">o Índice de Vulnerabilidade de Barganha. A primeira é inviável na base atual</w:t>
-      </w:r>
-      <w:r>
-        <w:t xml:space="preserve"> </w:t>
-      </w:r>
-      <w:r>
-        <w:t xml:space="preserve">porque exige a data exata da transferência. Mantemos a segunda integralmente</w:t>
-      </w:r>
-      <w:r>
-        <w:t xml:space="preserve"> </w:t>
-      </w:r>
-      <w:r>
-        <w:t xml:space="preserve">e propomos uma terceira métrica, originalmente nossa, que aproveita a</w:t>
-      </w:r>
-      <w:r>
-        <w:t xml:space="preserve"> </w:t>
-      </w:r>
-      <w:r>
-        <w:t xml:space="preserve">disponibilidade das features de rede.</w:t>
-      </w:r>
-    </w:p>
-    <w:bookmarkStart w:id="15" w:name="Xcde1416ec2be14f6febf825c0ddb4564a840cc7"/>
-    <w:p>
-      <w:pPr>
-        <w:pStyle w:val="Heading3"/>
-      </w:pPr>
-      <w:r>
-        <w:t xml:space="preserve">5.1 Índice de Vulnerabilidade de Barganha (IVB)</w:t>
+        <w:t xml:space="preserve">O ATE estimado é</w:t>
+      </w:r>
+      <w:r>
+        <w:t xml:space="preserve"> </w:t>
+      </w:r>
+      <w:r>
+        <w:rPr>
+          <w:b/>
+          <w:bCs/>
+        </w:rPr>
+        <w:t xml:space="preserve">θ = 0,0044</w:t>
+      </w:r>
+      <w:r>
+        <w:t xml:space="preserve"> </w:t>
+      </w:r>
+      <w:r>
+        <w:t xml:space="preserve">(IC 95 % HC1 [−0,0016; 0,0104]; IC clusterizado clube×temporada</w:t>
+      </w:r>
+      <w:r>
+        <w:t xml:space="preserve"> </w:t>
+      </w:r>
+      <w:r>
+        <w:t xml:space="preserve">[−0,0021; 0,0110]) —</w:t>
+      </w:r>
+      <w:r>
+        <w:t xml:space="preserve"> </w:t>
+      </w:r>
+      <w:r>
+        <w:rPr>
+          <w:b/>
+          <w:bCs/>
+        </w:rPr>
+        <w:t xml:space="preserve">não significativo</w:t>
+      </w:r>
+      <w:r>
+        <w:t xml:space="preserve">. A progressão OLS-ingênuo (0,0142*) → OLS+W (0,0051) →</w:t>
+      </w:r>
+      <w:r>
+        <w:t xml:space="preserve"> </w:t>
+      </w:r>
+      <w:r>
+        <w:t xml:space="preserve">DML (0,0044) mostra que a correlação bruta era majoritariamente o confundidor de porte (</w:t>
+      </w:r>
+      <w:r>
+        <w:t xml:space="preserve">“clube rico”</w:t>
+      </w:r>
+      <w:r>
+        <w:t xml:space="preserve">).</w:t>
       </w:r>
     </w:p>
     <w:p>
       <w:pPr>
-        <w:pStyle w:val="FirstParagraph"/>
-      </w:pPr>
-      <w:r>
-        <w:t xml:space="preserve">Estimando efeitos heterogêneos com o</w:t>
+        <w:pStyle w:val="BodyText"/>
+      </w:pPr>
+      <w:r>
+        <w:t xml:space="preserve">Estimando θ</w:t>
       </w:r>
       <w:r>
         <w:t xml:space="preserve"> </w:t>
@@ -4395,89 +4418,19 @@
           <w:b/>
           <w:bCs/>
         </w:rPr>
-        <w:t xml:space="preserve">R-learner</w:t>
-      </w:r>
-      <w:r>
-        <w:t xml:space="preserve"> </w:t>
-      </w:r>
-      <w:r>
-        <w:t xml:space="preserve">(substituto do</w:t>
-      </w:r>
-      <w:r>
-        <w:t xml:space="preserve"> </w:t>
-      </w:r>
-      <w:r>
-        <w:rPr>
-          <w:rStyle w:val="VerbatimChar"/>
-        </w:rPr>
-        <w:t xml:space="preserve">CausalForestDML</w:t>
-      </w:r>
-      <w:r>
-        <w:t xml:space="preserve">), obtemos</w:t>
-      </w:r>
-      <w:r>
-        <w:t xml:space="preserve"> </w:t>
-      </w:r>
-      <m:oMath>
-        <m:sSub>
-          <m:e>
-            <m:r>
-              <m:t>θ</m:t>
-            </m:r>
-          </m:e>
-          <m:sub>
-            <m:r>
-              <m:t>c</m:t>
-            </m:r>
-          </m:sub>
-        </m:sSub>
-      </m:oMath>
-      <w:r>
-        <w:t xml:space="preserve"> </w:t>
-      </w:r>
-      <w:r>
-        <w:t xml:space="preserve">para cada clube comprador (com ≥ 3 transações). O IVB normaliza esse efeito no</w:t>
-      </w:r>
-      <w:r>
-        <w:t xml:space="preserve"> </w:t>
-      </w:r>
-      <w:r>
-        <w:t xml:space="preserve">intervalo</w:t>
-      </w:r>
-      <w:r>
-        <w:t xml:space="preserve"> </w:t>
-      </w:r>
-      <m:oMath>
-        <m:r>
-          <m:rPr>
-            <m:sty m:val="p"/>
-          </m:rPr>
-          <m:t>[</m:t>
-        </m:r>
-        <m:r>
-          <m:t>0</m:t>
-        </m:r>
-        <m:r>
-          <m:rPr>
-            <m:sty m:val="p"/>
-          </m:rPr>
-          <m:t>,</m:t>
-        </m:r>
-        <m:r>
-          <m:t>1</m:t>
-        </m:r>
-        <m:r>
-          <m:rPr>
-            <m:sty m:val="p"/>
-          </m:rPr>
-          <m:t>]</m:t>
-        </m:r>
-      </m:oMath>
-      <w:r>
-        <w:t xml:space="preserve"> </w:t>
-      </w:r>
-      <w:r>
-        <w:t xml:space="preserve">(tratado como</w:t>
+        <w:t xml:space="preserve">por temporada</w:t>
+      </w:r>
+      <w:r>
+        <w:t xml:space="preserve"> </w:t>
+      </w:r>
+      <w:r>
+        <w:t xml:space="preserve">(IC clusterizado por clube + correção de múltiplas comparações), o</w:t>
+      </w:r>
+      <w:r>
+        <w:t xml:space="preserve"> </w:t>
+      </w:r>
+      <w:r>
+        <w:t xml:space="preserve">efeito é significativo</w:t>
       </w:r>
       <w:r>
         <w:t xml:space="preserve"> </w:t>
@@ -4487,13 +4440,120 @@
           <w:b/>
           <w:bCs/>
         </w:rPr>
-        <w:t xml:space="preserve">exploratório/ilustrativo</w:t>
-      </w:r>
-      <w:r>
-        <w:t xml:space="preserve"> </w:t>
-      </w:r>
-      <w:r>
-        <w:t xml:space="preserve">— dominado por outlier; ver notebook):</w:t>
+        <w:t xml:space="preserve">apenas em 2022 (+0,064) e 2023 (+0,047)</w:t>
+      </w:r>
+      <w:r>
+        <w:t xml:space="preserve"> </w:t>
+      </w:r>
+      <w:r>
+        <w:t xml:space="preserve">— o boom pós-COVID — e</w:t>
+      </w:r>
+      <w:r>
+        <w:t xml:space="preserve"> </w:t>
+      </w:r>
+      <w:r>
+        <w:rPr>
+          <w:b/>
+          <w:bCs/>
+        </w:rPr>
+        <w:t xml:space="preserve">sobrevive</w:t>
+      </w:r>
+      <w:r>
+        <w:rPr>
+          <w:b/>
+          <w:bCs/>
+        </w:rPr>
+        <w:t xml:space="preserve"> </w:t>
+      </w:r>
+      <w:r>
+        <w:rPr>
+          <w:b/>
+          <w:bCs/>
+        </w:rPr>
+        <w:t xml:space="preserve">a Bonferroni e FDR</w:t>
+      </w:r>
+      <w:r>
+        <w:t xml:space="preserve">. Este é o achado confirmatório: o prêmio do vendedor não é universal, emerge em</w:t>
+      </w:r>
+      <w:r>
+        <w:t xml:space="preserve"> </w:t>
+      </w:r>
+      <w:r>
+        <w:t xml:space="preserve">regime de mercado aquecido. (Validações na seção 6.)</w:t>
+      </w:r>
+    </w:p>
+    <w:bookmarkEnd w:id="15"/>
+    <w:bookmarkStart w:id="16" w:name="Xaa678d842e48be6cee4e60a4a555fe8acf0a0a6"/>
+    <w:p>
+      <w:pPr>
+        <w:pStyle w:val="Heading3"/>
+      </w:pPr>
+      <w:r>
+        <w:t xml:space="preserve">5.2 Índice de Vulnerabilidade de Barganha (IVB) — apêndice exploratório</w:t>
+      </w:r>
+    </w:p>
+    <w:p>
+      <w:pPr>
+        <w:pStyle w:val="FirstParagraph"/>
+      </w:pPr>
+      <w:r>
+        <w:t xml:space="preserve">Com o</w:t>
+      </w:r>
+      <w:r>
+        <w:t xml:space="preserve"> </w:t>
+      </w:r>
+      <w:r>
+        <w:rPr>
+          <w:b/>
+          <w:bCs/>
+        </w:rPr>
+        <w:t xml:space="preserve">R-learner</w:t>
+      </w:r>
+      <w:r>
+        <w:t xml:space="preserve"> </w:t>
+      </w:r>
+      <w:r>
+        <w:t xml:space="preserve">(substituto do</w:t>
+      </w:r>
+      <w:r>
+        <w:t xml:space="preserve"> </w:t>
+      </w:r>
+      <w:r>
+        <w:rPr>
+          <w:rStyle w:val="VerbatimChar"/>
+        </w:rPr>
+        <w:t xml:space="preserve">CausalForestDML</w:t>
+      </w:r>
+      <w:r>
+        <w:t xml:space="preserve">) obtemos um CATE por observação, agregado por</w:t>
+      </w:r>
+      <w:r>
+        <w:t xml:space="preserve"> </w:t>
+      </w:r>
+      <w:r>
+        <w:t xml:space="preserve">clube (≥ 3 transações). O IVB usa</w:t>
+      </w:r>
+      <w:r>
+        <w:t xml:space="preserve"> </w:t>
+      </w:r>
+      <w:r>
+        <w:rPr>
+          <w:b/>
+          <w:bCs/>
+        </w:rPr>
+        <w:t xml:space="preserve">normalização por percentil</w:t>
+      </w:r>
+      <w:r>
+        <w:t xml:space="preserve"> </w:t>
+      </w:r>
+      <w:r>
+        <w:t xml:space="preserve">do CATE médio do clube — imune ao</w:t>
+      </w:r>
+      <w:r>
+        <w:t xml:space="preserve"> </w:t>
+      </w:r>
+      <w:r>
+        <w:t xml:space="preserve">outlier que dominava a versão min-max:</w:t>
       </w:r>
     </w:p>
     <w:p>
@@ -4529,241 +4589,6 @@
             </m:rPr>
             <m:t>=</m:t>
           </m:r>
-          <m:f>
-            <m:fPr>
-              <m:type m:val="bar"/>
-            </m:fPr>
-            <m:num>
-              <m:sSub>
-                <m:e>
-                  <m:r>
-                    <m:t>θ</m:t>
-                  </m:r>
-                </m:e>
-                <m:sub>
-                  <m:r>
-                    <m:t>c</m:t>
-                  </m:r>
-                </m:sub>
-              </m:sSub>
-              <m:r>
-                <m:rPr>
-                  <m:sty m:val="p"/>
-                </m:rPr>
-                <m:t>−</m:t>
-              </m:r>
-              <m:r>
-                <m:rPr>
-                  <m:sty m:val="p"/>
-                </m:rPr>
-                <m:t>min</m:t>
-              </m:r>
-              <m:r>
-                <m:rPr>
-                  <m:sty m:val="p"/>
-                </m:rPr>
-                <m:t>(</m:t>
-              </m:r>
-              <m:r>
-                <m:rPr>
-                  <m:sty m:val="p"/>
-                </m:rPr>
-                <m:t>Θ</m:t>
-              </m:r>
-              <m:r>
-                <m:rPr>
-                  <m:sty m:val="p"/>
-                </m:rPr>
-                <m:t>)</m:t>
-              </m:r>
-            </m:num>
-            <m:den>
-              <m:r>
-                <m:rPr>
-                  <m:sty m:val="p"/>
-                </m:rPr>
-                <m:t>max</m:t>
-              </m:r>
-              <m:r>
-                <m:rPr>
-                  <m:sty m:val="p"/>
-                </m:rPr>
-                <m:t>(</m:t>
-              </m:r>
-              <m:r>
-                <m:rPr>
-                  <m:sty m:val="p"/>
-                </m:rPr>
-                <m:t>Θ</m:t>
-              </m:r>
-              <m:r>
-                <m:rPr>
-                  <m:sty m:val="p"/>
-                </m:rPr>
-                <m:t>)</m:t>
-              </m:r>
-              <m:r>
-                <m:rPr>
-                  <m:sty m:val="p"/>
-                </m:rPr>
-                <m:t>−</m:t>
-              </m:r>
-              <m:r>
-                <m:rPr>
-                  <m:sty m:val="p"/>
-                </m:rPr>
-                <m:t>min</m:t>
-              </m:r>
-              <m:r>
-                <m:rPr>
-                  <m:sty m:val="p"/>
-                </m:rPr>
-                <m:t>(</m:t>
-              </m:r>
-              <m:r>
-                <m:rPr>
-                  <m:sty m:val="p"/>
-                </m:rPr>
-                <m:t>Θ</m:t>
-              </m:r>
-              <m:r>
-                <m:rPr>
-                  <m:sty m:val="p"/>
-                </m:rPr>
-                <m:t>)</m:t>
-              </m:r>
-            </m:den>
-          </m:f>
-        </m:oMath>
-      </m:oMathPara>
-    </w:p>
-    <w:p>
-      <w:pPr>
-        <w:pStyle w:val="FirstParagraph"/>
-      </w:pPr>
-      <w:r>
-        <w:t xml:space="preserve">Clubes com IVB alto são</w:t>
-      </w:r>
-      <w:r>
-        <w:t xml:space="preserve"> </w:t>
-      </w:r>
-      <w:r>
-        <w:t xml:space="preserve">“presas fáceis”</w:t>
-      </w:r>
-      <w:r>
-        <w:t xml:space="preserve"> </w:t>
-      </w:r>
-      <w:r>
-        <w:t xml:space="preserve">— pagam sobrepreços maiores quando</w:t>
-      </w:r>
-      <w:r>
-        <w:t xml:space="preserve"> </w:t>
-      </w:r>
-      <w:r>
-        <w:t xml:space="preserve">chegam ao mercado recém-capitalizados. Clubes com IVB baixo são negociadores</w:t>
-      </w:r>
-      <w:r>
-        <w:t xml:space="preserve"> </w:t>
-      </w:r>
-      <w:r>
-        <w:t xml:space="preserve">disciplinados, capazes de reciclar capital sem ceder à pressão.</w:t>
-      </w:r>
-    </w:p>
-    <w:p>
-      <w:pPr>
-        <w:pStyle w:val="BodyText"/>
-      </w:pPr>
-      <w:r>
-        <w:t xml:space="preserve">A mesma lógica, aplicada do lado vendedor, identifica os</w:t>
-      </w:r>
-      <w:r>
-        <w:t xml:space="preserve"> </w:t>
-      </w:r>
-      <w:r>
-        <w:t xml:space="preserve">“clubes predadores”</w:t>
-      </w:r>
-      <w:r>
-        <w:t xml:space="preserve"> </w:t>
-      </w:r>
-      <w:r>
-        <w:t xml:space="preserve">— times que extraem as maiores taxas de prêmio positivo quando abordados</w:t>
-      </w:r>
-      <w:r>
-        <w:t xml:space="preserve"> </w:t>
-      </w:r>
-      <w:r>
-        <w:t xml:space="preserve">por compradores recém-capitalizados.</w:t>
-      </w:r>
-    </w:p>
-    <w:bookmarkEnd w:id="15"/>
-    <w:bookmarkStart w:id="16" w:name="X66c08032add95d39b5a2781cf799ce9875afc03"/>
-    <w:p>
-      <w:pPr>
-        <w:pStyle w:val="Heading3"/>
-      </w:pPr>
-      <w:r>
-        <w:t xml:space="preserve">5.2 Sensibilidade do prêmio à centralidade na rede (substitui a Curva θ(Δt))</w:t>
-      </w:r>
-    </w:p>
-    <w:p>
-      <w:pPr>
-        <w:pStyle w:val="FirstParagraph"/>
-      </w:pPr>
-      <w:r>
-        <w:t xml:space="preserve">Sem datas diárias, não podemos modelar o decaimento temporal proposto. Em</w:t>
-      </w:r>
-      <w:r>
-        <w:t xml:space="preserve"> </w:t>
-      </w:r>
-      <w:r>
-        <w:t xml:space="preserve">contrapartida, exploramos uma dimensão ortogonal que a base permite: a</w:t>
-      </w:r>
-      <w:r>
-        <w:t xml:space="preserve"> </w:t>
-      </w:r>
-      <w:r>
-        <w:rPr>
-          <w:b/>
-          <w:bCs/>
-        </w:rPr>
-        <w:t xml:space="preserve">heterogeneidade do efeito segundo a posição estrutural do comprador na</w:t>
-      </w:r>
-      <w:r>
-        <w:rPr>
-          <w:b/>
-          <w:bCs/>
-        </w:rPr>
-        <w:t xml:space="preserve"> </w:t>
-      </w:r>
-      <w:r>
-        <w:rPr>
-          <w:b/>
-          <w:bCs/>
-        </w:rPr>
-        <w:t xml:space="preserve">rede de transferências</w:t>
-      </w:r>
-      <w:r>
-        <w:t xml:space="preserve">. Parametrizamos:</w:t>
-      </w:r>
-    </w:p>
-    <w:p>
-      <w:pPr>
-        <w:pStyle w:val="BodyText"/>
-      </w:pPr>
-      <m:oMathPara>
-        <m:oMathParaPr>
-          <m:jc m:val="center"/>
-        </m:oMathParaPr>
-        <m:oMath>
-          <m:r>
-            <m:t>θ</m:t>
-          </m:r>
-          <m:r>
-            <m:rPr>
-              <m:sty m:val="p"/>
-            </m:rPr>
-            <m:t>(</m:t>
-          </m:r>
           <m:sSub>
             <m:e>
               <m:r>
@@ -4771,7 +4596,7 @@
                   <m:nor/>
                   <m:sty m:val="p"/>
                 </m:rPr>
-                <m:t>PageRank</m:t>
+                <m:t>percentil</m:t>
               </m:r>
             </m:e>
             <m:sub>
@@ -4784,72 +4609,20 @@
             <m:rPr>
               <m:sty m:val="p"/>
             </m:rPr>
-            <m:t>)</m:t>
-          </m:r>
-          <m:r>
-            <m:rPr>
-              <m:sty m:val="p"/>
-            </m:rPr>
-            <m:t>=</m:t>
-          </m:r>
-          <m:sSub>
-            <m:e>
-              <m:r>
-                <m:t>θ</m:t>
-              </m:r>
-            </m:e>
-            <m:sub>
-              <m:r>
-                <m:t>0</m:t>
-              </m:r>
-            </m:sub>
-          </m:sSub>
-          <m:r>
-            <m:rPr>
-              <m:sty m:val="p"/>
-            </m:rPr>
-            <m:t>+</m:t>
-          </m:r>
-          <m:sSub>
-            <m:e>
-              <m:r>
-                <m:t>θ</m:t>
-              </m:r>
-            </m:e>
-            <m:sub>
-              <m:r>
-                <m:t>1</m:t>
-              </m:r>
-            </m:sub>
-          </m:sSub>
-          <m:r>
-            <m:rPr>
-              <m:sty m:val="p"/>
-            </m:rPr>
-            <m:t>⋅</m:t>
-          </m:r>
-          <m:r>
-            <m:rPr>
-              <m:nor/>
-              <m:sty m:val="p"/>
-            </m:rPr>
-            <m:t>quartil</m:t>
-          </m:r>
-          <m:r>
-            <m:rPr>
-              <m:sty m:val="p"/>
-            </m:rPr>
             <m:t>(</m:t>
           </m:r>
           <m:sSub>
             <m:e>
-              <m:r>
-                <m:rPr>
-                  <m:nor/>
-                  <m:sty m:val="p"/>
-                </m:rPr>
-                <m:t>PageRank</m:t>
-              </m:r>
+              <m:bar>
+                <m:barPr>
+                  <m:pos m:val="top"/>
+                </m:barPr>
+                <m:e>
+                  <m:r>
+                    <m:t>θ</m:t>
+                  </m:r>
+                </m:e>
+              </m:bar>
             </m:e>
             <m:sub>
               <m:r>
@@ -4868,65 +4641,34 @@
     </w:p>
     <w:p>
       <w:pPr>
-        <w:pStyle w:val="FirstParagraph"/>
-      </w:pPr>
-      <w:r>
-        <w:t xml:space="preserve">A hipótese testada é que clubes centrais (alta centralidade de PageRank,</w:t>
-      </w:r>
-      <w:r>
-        <w:t xml:space="preserve"> </w:t>
-      </w:r>
-      <w:r>
-        <w:t xml:space="preserve">top-25 % do mercado) sofrem prêmios menores que clubes periféricos, por</w:t>
-      </w:r>
-      <w:r>
-        <w:t xml:space="preserve"> </w:t>
-      </w:r>
-      <w:r>
-        <w:t xml:space="preserve">deterem informação superior e poder de barganha estrutural. Essa</w:t>
-      </w:r>
-      <w:r>
-        <w:t xml:space="preserve"> </w:t>
-      </w:r>
-      <w:r>
-        <w:t xml:space="preserve">parametrização entrega um insight gerencial direto:</w:t>
-      </w:r>
-      <w:r>
-        <w:t xml:space="preserve"> </w:t>
-      </w:r>
-      <w:r>
-        <w:rPr>
-          <w:i/>
-          <w:iCs/>
-        </w:rPr>
-        <w:t xml:space="preserve">quanto vale, em</w:t>
-      </w:r>
-      <w:r>
-        <w:rPr>
-          <w:i/>
-          <w:iCs/>
-        </w:rPr>
-        <w:t xml:space="preserve"> </w:t>
-      </w:r>
-      <w:r>
-        <w:rPr>
-          <w:i/>
-          <w:iCs/>
-        </w:rPr>
-        <w:t xml:space="preserve">euros, estar posicionado no núcleo da rede de transferências</w:t>
-      </w:r>
-      <w:r>
-        <w:t xml:space="preserve">.</w:t>
+        <w:pStyle w:val="BlockText"/>
+      </w:pPr>
+      <w:r>
+        <w:t xml:space="preserve">⚠️ Como o R² de 1ª etapa em Y é só 0,06, há pouco sinal de heterogeneidade genuína. O IVB é</w:t>
+      </w:r>
+      <w:r>
+        <w:t xml:space="preserve"> </w:t>
+      </w:r>
+      <w:r>
+        <w:rPr>
+          <w:b/>
+          <w:bCs/>
+        </w:rPr>
+        <w:t xml:space="preserve">apêndice ilustrativo / prova de conceito</w:t>
+      </w:r>
+      <w:r>
+        <w:t xml:space="preserve">, não ferramenta de decisão.</w:t>
       </w:r>
     </w:p>
     <w:bookmarkEnd w:id="16"/>
-    <w:bookmarkStart w:id="17" w:name="X137a21fde030122a2a2849c3c643ae074de32d5"/>
+    <w:bookmarkEnd w:id="17"/>
+    <w:bookmarkStart w:id="18" w:name="testes-de-robustez-executados"/>
     <w:p>
       <w:pPr>
-        <w:pStyle w:val="Heading3"/>
-      </w:pPr>
-      <w:r>
-        <w:t xml:space="preserve">5.3 Curva temporal por temporada (proxy do decaimento)</w:t>
+        <w:pStyle w:val="Heading2"/>
+      </w:pPr>
+      <w:r>
+        <w:t xml:space="preserve">6. Testes de robustez (executados)</w:t>
       </w:r>
     </w:p>
     <w:p>
@@ -4934,173 +4676,34 @@
         <w:pStyle w:val="FirstParagraph"/>
       </w:pPr>
       <w:r>
-        <w:t xml:space="preserve">Como degradação aceitável da curva</w:t>
-      </w:r>
-      <w:r>
-        <w:t xml:space="preserve"> </w:t>
-      </w:r>
-      <m:oMath>
-        <m:r>
-          <m:t>θ</m:t>
-        </m:r>
-        <m:r>
-          <m:rPr>
-            <m:sty m:val="p"/>
-          </m:rPr>
-          <m:t>(</m:t>
-        </m:r>
-        <m:r>
-          <m:rPr>
-            <m:sty m:val="p"/>
-          </m:rPr>
-          <m:t>Δ</m:t>
-        </m:r>
-        <m:r>
-          <m:t>t</m:t>
-        </m:r>
-        <m:r>
-          <m:rPr>
-            <m:sty m:val="p"/>
-          </m:rPr>
-          <m:t>)</m:t>
-        </m:r>
-      </m:oMath>
-      <w:r>
-        <w:t xml:space="preserve"> </w:t>
-      </w:r>
-      <w:r>
-        <w:t xml:space="preserve">original, estimamos</w:t>
-      </w:r>
-      <w:r>
-        <w:t xml:space="preserve"> </w:t>
-      </w:r>
-      <m:oMath>
-        <m:sSub>
-          <m:e>
-            <m:r>
-              <m:t>θ</m:t>
-            </m:r>
-          </m:e>
-          <m:sub>
-            <m:r>
-              <m:t>t</m:t>
-            </m:r>
-          </m:sub>
-        </m:sSub>
-      </m:oMath>
-      <w:r>
-        <w:t xml:space="preserve"> </w:t>
-      </w:r>
-      <w:r>
-        <w:t xml:space="preserve">separadamente para cada temporada</w:t>
-      </w:r>
-      <w:r>
-        <w:t xml:space="preserve"> </w:t>
-      </w:r>
-      <m:oMath>
-        <m:r>
-          <m:t>t</m:t>
-        </m:r>
-        <m:r>
-          <m:rPr>
-            <m:sty m:val="p"/>
-          </m:rPr>
-          <m:t>∈</m:t>
-        </m:r>
-        <m:r>
-          <m:rPr>
-            <m:sty m:val="p"/>
-          </m:rPr>
-          <m:t>{</m:t>
-        </m:r>
-        <m:r>
-          <m:t>2017</m:t>
-        </m:r>
-        <m:r>
-          <m:rPr>
-            <m:sty m:val="p"/>
-          </m:rPr>
-          <m:t>,</m:t>
-        </m:r>
-        <m:r>
-          <m:rPr>
-            <m:sty m:val="p"/>
-          </m:rPr>
-          <m:t>…</m:t>
-        </m:r>
-        <m:r>
-          <m:rPr>
-            <m:sty m:val="p"/>
-          </m:rPr>
-          <m:t>,</m:t>
-        </m:r>
-        <m:r>
-          <m:t>2025</m:t>
-        </m:r>
-        <m:r>
-          <m:rPr>
-            <m:sty m:val="p"/>
-          </m:rPr>
-          <m:t>}</m:t>
-        </m:r>
-      </m:oMath>
-      <w:r>
-        <w:t xml:space="preserve"> </w:t>
-      </w:r>
-      <w:r>
-        <w:t xml:space="preserve">(exceto 2020).</w:t>
-      </w:r>
-      <w:r>
-        <w:t xml:space="preserve"> </w:t>
-      </w:r>
-      <w:r>
-        <w:t xml:space="preserve">O resultado é o</w:t>
-      </w:r>
-      <w:r>
-        <w:t xml:space="preserve"> </w:t>
-      </w:r>
-      <w:r>
-        <w:rPr>
-          <w:b/>
-          <w:bCs/>
-        </w:rPr>
-        <w:t xml:space="preserve">achado central</w:t>
-      </w:r>
-      <w:r>
-        <w:t xml:space="preserve">: o efeito é significativo apenas em</w:t>
-      </w:r>
-      <w:r>
-        <w:t xml:space="preserve"> </w:t>
-      </w:r>
-      <w:r>
-        <w:rPr>
-          <w:b/>
-          <w:bCs/>
-        </w:rPr>
-        <w:t xml:space="preserve">2022 e 2023</w:t>
-      </w:r>
-      <w:r>
-        <w:t xml:space="preserve"> </w:t>
-      </w:r>
-      <w:r>
-        <w:t xml:space="preserve">(boom</w:t>
-      </w:r>
-      <w:r>
-        <w:t xml:space="preserve"> </w:t>
-      </w:r>
-      <w:r>
-        <w:t xml:space="preserve">pós-COVID), sobrevivendo a Bonferroni/FDR; nas demais temporadas é indistinguível de zero.</w:t>
-      </w:r>
-    </w:p>
-    <w:bookmarkEnd w:id="17"/>
-    <w:bookmarkEnd w:id="18"/>
-    <w:bookmarkStart w:id="19" w:name="testes-de-robustez-planejados"/>
-    <w:p>
-      <w:pPr>
-        <w:pStyle w:val="Heading2"/>
-      </w:pPr>
-      <w:r>
-        <w:t xml:space="preserve">6. Testes de robustez planejados</w:t>
+        <w:t xml:space="preserve">Implementados em</w:t>
+      </w:r>
+      <w:r>
+        <w:t xml:space="preserve"> </w:t>
+      </w:r>
+      <w:r>
+        <w:rPr>
+          <w:rStyle w:val="VerbatimChar"/>
+        </w:rPr>
+        <w:t xml:space="preserve">etapa2_robustez.ipynb</w:t>
+      </w:r>
+      <w:r>
+        <w:t xml:space="preserve"> </w:t>
+      </w:r>
+      <w:r>
+        <w:t xml:space="preserve">e</w:t>
+      </w:r>
+      <w:r>
+        <w:t xml:space="preserve"> </w:t>
+      </w:r>
+      <w:r>
+        <w:rPr>
+          <w:rStyle w:val="VerbatimChar"/>
+        </w:rPr>
+        <w:t xml:space="preserve">etapa2_double_ml.ipynb</w:t>
+      </w:r>
+      <w:r>
+        <w:t xml:space="preserve">:</w:t>
       </w:r>
     </w:p>
     <w:p>
@@ -5141,10 +4744,7 @@
         <w:t xml:space="preserve"> </w:t>
       </w:r>
       <w:r>
-        <w:t xml:space="preserve">Replicar com $D = $</w:t>
-      </w:r>
-      <w:r>
-        <w:t xml:space="preserve"> </w:t>
+        <w:t xml:space="preserve">D₁=</w:t>
       </w:r>
       <w:r>
         <w:rPr>
@@ -5153,31 +4753,87 @@
         <w:t xml:space="preserve">log_revenue</w:t>
       </w:r>
       <w:r>
-        <w:t xml:space="preserve">, com</w:t>
-      </w:r>
-      <w:r>
-        <w:t xml:space="preserve"> </w:t>
+        <w:t xml:space="preserve"> </w:t>
+      </w:r>
+      <w:r>
+        <w:t xml:space="preserve">(n.s.), D₂=</w:t>
       </w:r>
       <w:r>
         <w:rPr>
           <w:rStyle w:val="VerbatimChar"/>
         </w:rPr>
-        <w:t xml:space="preserve">n_sales</w:t>
-      </w:r>
-      <w:r>
-        <w:t xml:space="preserve"> </w:t>
-      </w:r>
-      <w:r>
-        <w:t xml:space="preserve">e com a flag binária</w:t>
-      </w:r>
-      <w:r>
-        <w:t xml:space="preserve"> </w:t>
+        <w:t xml:space="preserve">log(n_sales)</w:t>
+      </w:r>
+      <w:r>
+        <w:t xml:space="preserve">, D₃=</w:t>
       </w:r>
       <w:r>
         <w:rPr>
           <w:rStyle w:val="VerbatimChar"/>
         </w:rPr>
         <w:t xml:space="preserve">big_sale</w:t>
+      </w:r>
+      <w:r>
+        <w:t xml:space="preserve">. D₂/D₃ são</w:t>
+      </w:r>
+      <w:r>
+        <w:t xml:space="preserve"> </w:t>
+      </w:r>
+      <w:r>
+        <w:t xml:space="preserve">significativos no bruto, mas</w:t>
+      </w:r>
+      <w:r>
+        <w:t xml:space="preserve"> </w:t>
+      </w:r>
+      <w:r>
+        <w:rPr>
+          <w:b/>
+          <w:bCs/>
+        </w:rPr>
+        <w:t xml:space="preserve">perdem significância</w:t>
+      </w:r>
+      <w:r>
+        <w:t xml:space="preserve"> </w:t>
+      </w:r>
+      <w:r>
+        <w:t xml:space="preserve">ao controlar intensidade de janela</w:t>
+      </w:r>
+      <w:r>
+        <w:t xml:space="preserve"> </w:t>
+      </w:r>
+      <w:r>
+        <w:t xml:space="preserve">(</w:t>
+      </w:r>
+      <w:r>
+        <w:rPr>
+          <w:rStyle w:val="VerbatimChar"/>
+        </w:rPr>
+        <w:t xml:space="preserve">n_buys</w:t>
+      </w:r>
+      <w:r>
+        <w:t xml:space="preserve">+gasto) → o</w:t>
+      </w:r>
+      <w:r>
+        <w:t xml:space="preserve"> </w:t>
+      </w:r>
+      <w:r>
+        <w:t xml:space="preserve">“mecanismo de sinalização”</w:t>
+      </w:r>
+      <w:r>
+        <w:t xml:space="preserve"> </w:t>
+      </w:r>
+      <w:r>
+        <w:t xml:space="preserve">é</w:t>
+      </w:r>
+      <w:r>
+        <w:t xml:space="preserve"> </w:t>
+      </w:r>
+      <w:r>
+        <w:rPr>
+          <w:b/>
+          <w:bCs/>
+        </w:rPr>
+        <w:t xml:space="preserve">exploratório, não confirmatório</w:t>
       </w:r>
       <w:r>
         <w:t xml:space="preserve">.</w:t>
@@ -5196,33 +4852,13 @@
           <w:b/>
           <w:bCs/>
         </w:rPr>
-        <w:t xml:space="preserve">Subgrupos.</w:t>
-      </w:r>
-      <w:r>
-        <w:t xml:space="preserve"> </w:t>
-      </w:r>
-      <w:r>
-        <w:t xml:space="preserve">Estimar</w:t>
-      </w:r>
-      <w:r>
-        <w:t xml:space="preserve"> </w:t>
-      </w:r>
-      <m:oMath>
-        <m:r>
-          <m:t>θ</m:t>
-        </m:r>
-      </m:oMath>
-      <w:r>
-        <w:t xml:space="preserve"> </w:t>
-      </w:r>
-      <w:r>
-        <w:t xml:space="preserve">por tier de comprador (top-5 ligas vs.</w:t>
-      </w:r>
-      <w:r>
-        <w:t xml:space="preserve"> </w:t>
-      </w:r>
-      <w:r>
-        <w:t xml:space="preserve">demais) e por posição do jogador.</w:t>
+        <w:t xml:space="preserve">Subgrupos por tier de liga.</w:t>
+      </w:r>
+      <w:r>
+        <w:t xml:space="preserve"> </w:t>
+      </w:r>
+      <w:r>
+        <w:t xml:space="preserve">Top-4 vs. ligas menores — nenhum significativo na média (cluster).</w:t>
       </w:r>
     </w:p>
     <w:p>
@@ -5238,52 +4874,13 @@
           <w:b/>
           <w:bCs/>
         </w:rPr>
-        <w:t xml:space="preserve">Placebo.</w:t>
-      </w:r>
-      <w:r>
-        <w:t xml:space="preserve"> </w:t>
-      </w:r>
-      <w:r>
-        <w:t xml:space="preserve">Aleatorizar</w:t>
-      </w:r>
-      <w:r>
-        <w:t xml:space="preserve"> </w:t>
-      </w:r>
-      <m:oMath>
-        <m:r>
-          <m:t>D</m:t>
-        </m:r>
-      </m:oMath>
-      <w:r>
-        <w:t xml:space="preserve"> </w:t>
-      </w:r>
-      <w:r>
-        <w:t xml:space="preserve">entre clubes mantendo a estrutura de</w:t>
-      </w:r>
-      <w:r>
-        <w:t xml:space="preserve"> </w:t>
-      </w:r>
-      <m:oMath>
-        <m:r>
-          <m:t>W</m:t>
-        </m:r>
-      </m:oMath>
-      <w:r>
-        <w:t xml:space="preserve">;</w:t>
-      </w:r>
-      <w:r>
-        <w:t xml:space="preserve"> </w:t>
-      </w:r>
-      <m:oMath>
-        <m:r>
-          <m:t>θ</m:t>
-        </m:r>
-      </m:oMath>
-      <w:r>
-        <w:t xml:space="preserve"> </w:t>
-      </w:r>
-      <w:r>
-        <w:t xml:space="preserve">estimado deve ser estatisticamente indistinguível de zero.</w:t>
+        <w:t xml:space="preserve">Placebos globais.</w:t>
+      </w:r>
+      <w:r>
+        <w:t xml:space="preserve"> </w:t>
+      </w:r>
+      <w:r>
+        <w:t xml:space="preserve">D embaralhado (θ≈0,002) e ruído gaussiano (θ≈0,001) — ICs cruzam zero.</w:t>
       </w:r>
     </w:p>
     <w:p>
@@ -5299,25 +4896,35 @@
           <w:b/>
           <w:bCs/>
         </w:rPr>
-        <w:t xml:space="preserve">Reverse causation.</w:t>
-      </w:r>
-      <w:r>
-        <w:t xml:space="preserve"> </w:t>
-      </w:r>
-      <w:r>
-        <w:t xml:space="preserve">Reestimar com tratamento defasado (lag de uma</w:t>
-      </w:r>
-      <w:r>
-        <w:t xml:space="preserve"> </w:t>
-      </w:r>
-      <w:r>
-        <w:t xml:space="preserve">temporada) — se o efeito persistir, a hipótese de causalidade reversa</w:t>
-      </w:r>
-      <w:r>
-        <w:t xml:space="preserve"> </w:t>
-      </w:r>
-      <w:r>
-        <w:t xml:space="preserve">(C2) enfraquece.</w:t>
+        <w:t xml:space="preserve">Placebo dentro da temporada.</w:t>
+      </w:r>
+      <w:r>
+        <w:t xml:space="preserve"> </w:t>
+      </w:r>
+      <w:r>
+        <w:t xml:space="preserve">Permuta D entre clubes de 2022/2023 (200×): θ observado fica fora</w:t>
+      </w:r>
+      <w:r>
+        <w:t xml:space="preserve"> </w:t>
+      </w:r>
+      <w:r>
+        <w:t xml:space="preserve">do nulo,</w:t>
+      </w:r>
+      <w:r>
+        <w:t xml:space="preserve"> </w:t>
+      </w:r>
+      <w:r>
+        <w:rPr>
+          <w:b/>
+          <w:bCs/>
+        </w:rPr>
+        <w:t xml:space="preserve">p empírico = 0,005</w:t>
+      </w:r>
+      <w:r>
+        <w:t xml:space="preserve"> </w:t>
+      </w:r>
+      <w:r>
+        <w:t xml:space="preserve">— o efeito sazonal não é artefato do desenho.</w:t>
       </w:r>
     </w:p>
     <w:p>
@@ -5333,19 +4940,299 @@
           <w:b/>
           <w:bCs/>
         </w:rPr>
-        <w:t xml:space="preserve">PSM como sanity check do C6.</w:t>
-      </w:r>
-      <w:r>
-        <w:t xml:space="preserve"> </w:t>
-      </w:r>
-      <w:r>
-        <w:t xml:space="preserve">Construir pares de clubes com</w:t>
-      </w:r>
-      <w:r>
-        <w:t xml:space="preserve"> </w:t>
-      </w:r>
-      <w:r>
-        <w:t xml:space="preserve">propensity score similar (alto vs. baixo</w:t>
+        <w:t xml:space="preserve">Causalidade reversa (C2).</w:t>
+      </w:r>
+      <w:r>
+        <w:t xml:space="preserve"> </w:t>
+      </w:r>
+      <w:r>
+        <w:t xml:space="preserve">Tratamento defasado t−1 (θ=0,0051*, cluster) — enfraquece C2, mas</w:t>
+      </w:r>
+      <w:r>
+        <w:t xml:space="preserve"> </w:t>
+      </w:r>
+      <w:r>
+        <w:rPr>
+          <w:b/>
+          <w:bCs/>
+        </w:rPr>
+        <w:t xml:space="preserve">não conclusivo</w:t>
+      </w:r>
+      <w:r>
+        <w:t xml:space="preserve"> </w:t>
+      </w:r>
+      <w:r>
+        <w:t xml:space="preserve">(o contemporâneo é n.s. na mesma subamostra → o lag pode captar traço de clube).</w:t>
+      </w:r>
+    </w:p>
+    <w:p>
+      <w:pPr>
+        <w:pStyle w:val="Compact"/>
+        <w:numPr>
+          <w:ilvl w:val="0"/>
+          <w:numId w:val="1002"/>
+        </w:numPr>
+      </w:pPr>
+      <w:r>
+        <w:rPr>
+          <w:b/>
+          <w:bCs/>
+        </w:rPr>
+        <w:t xml:space="preserve">Sensibilidade ao corte de fee (C6).</w:t>
+      </w:r>
+      <w:r>
+        <w:t xml:space="preserve"> </w:t>
+      </w:r>
+      <w:r>
+        <w:t xml:space="preserve">Pipeline reconstruído a €0/100k/250k/500k/1M — ATE nulo em</w:t>
+      </w:r>
+      <w:r>
+        <w:t xml:space="preserve"> </w:t>
+      </w:r>
+      <w:r>
+        <w:t xml:space="preserve">todos; 2022/2023 estáveis de €0 a €500k. Achados não dependem do corte.</w:t>
+      </w:r>
+    </w:p>
+    <w:p>
+      <w:pPr>
+        <w:pStyle w:val="Compact"/>
+        <w:numPr>
+          <w:ilvl w:val="0"/>
+          <w:numId w:val="1002"/>
+        </w:numPr>
+      </w:pPr>
+      <w:r>
+        <w:rPr>
+          <w:b/>
+          <w:bCs/>
+        </w:rPr>
+        <w:t xml:space="preserve">Sensibilidade à identificação.</w:t>
+      </w:r>
+      <w:r>
+        <w:t xml:space="preserve"> </w:t>
+      </w:r>
+      <w:r>
+        <w:t xml:space="preserve">Robustness Value (Cinelli-Hazlett) ≈ 0,24–0,27 para 2022/2023;</w:t>
+      </w:r>
+      <w:r>
+        <w:t xml:space="preserve"> </w:t>
+      </w:r>
+      <w:r>
+        <w:t xml:space="preserve">stress test com financeiros contemporâneos (over-control) — 2023 sobrevive, 2022 atenua.</w:t>
+      </w:r>
+    </w:p>
+    <w:p>
+      <w:pPr>
+        <w:pStyle w:val="FirstParagraph"/>
+      </w:pPr>
+      <w:r>
+        <w:rPr>
+          <w:b/>
+          <w:bCs/>
+        </w:rPr>
+        <w:t xml:space="preserve">PSM não foi executado</w:t>
+      </w:r>
+      <w:r>
+        <w:t xml:space="preserve"> </w:t>
+      </w:r>
+      <w:r>
+        <w:t xml:space="preserve">(substituído pelo controle não-paramétrico via DML) — ver seção 7.</w:t>
+      </w:r>
+    </w:p>
+    <w:bookmarkEnd w:id="18"/>
+    <w:bookmarkStart w:id="19" w:name="limitações-reconhecidas"/>
+    <w:p>
+      <w:pPr>
+        <w:pStyle w:val="Heading2"/>
+      </w:pPr>
+      <w:r>
+        <w:t xml:space="preserve">7. Limitações reconhecidas</w:t>
+      </w:r>
+    </w:p>
+    <w:p>
+      <w:pPr>
+        <w:pStyle w:val="Compact"/>
+        <w:numPr>
+          <w:ilvl w:val="0"/>
+          <w:numId w:val="1003"/>
+        </w:numPr>
+      </w:pPr>
+      <w:r>
+        <w:rPr>
+          <w:b/>
+          <w:bCs/>
+        </w:rPr>
+        <w:t xml:space="preserve">Identificação por</w:t>
+      </w:r>
+      <w:r>
+        <w:rPr>
+          <w:b/>
+          <w:bCs/>
+        </w:rPr>
+        <w:t xml:space="preserve"> </w:t>
+      </w:r>
+      <w:r>
+        <w:rPr>
+          <w:b/>
+          <w:bCs/>
+          <w:i/>
+          <w:iCs/>
+        </w:rPr>
+        <w:t xml:space="preserve">selection-on-observables</w:t>
+      </w:r>
+      <w:r>
+        <w:rPr>
+          <w:b/>
+          <w:bCs/>
+        </w:rPr>
+        <w:t xml:space="preserve">.</w:t>
+      </w:r>
+      <w:r>
+        <w:t xml:space="preserve"> </w:t>
+      </w:r>
+      <w:r>
+        <w:t xml:space="preserve">O confundidor C1 (</w:t>
+      </w:r>
+      <w:r>
+        <w:t xml:space="preserve">“clube rico”</w:t>
+      </w:r>
+      <w:r>
+        <w:t xml:space="preserve">) é controlado por</w:t>
+      </w:r>
+      <w:r>
+        <w:t xml:space="preserve"> </w:t>
+      </w:r>
+      <w:r>
+        <w:rPr>
+          <w:i/>
+          <w:iCs/>
+        </w:rPr>
+        <w:t xml:space="preserve">proxies</w:t>
+      </w:r>
+      <w:r>
+        <w:t xml:space="preserve"> </w:t>
+      </w:r>
+      <w:r>
+        <w:t xml:space="preserve">de rede/elenco, sem o bloco financeiro direto (que seria</w:t>
+      </w:r>
+      <w:r>
+        <w:t xml:space="preserve"> </w:t>
+      </w:r>
+      <w:r>
+        <w:rPr>
+          <w:i/>
+          <w:iCs/>
+        </w:rPr>
+        <w:t xml:space="preserve">bad control</w:t>
+      </w:r>
+      <w:r>
+        <w:t xml:space="preserve">). Com R²_y=0,06,</w:t>
+      </w:r>
+      <w:r>
+        <w:t xml:space="preserve"> </w:t>
+      </w:r>
+      <w:r>
+        <w:t xml:space="preserve">isso não é verificável; o Robustness Value (0,24–0,27) mitiga, mas não substitui um instrumento.</w:t>
+      </w:r>
+    </w:p>
+    <w:p>
+      <w:pPr>
+        <w:pStyle w:val="Compact"/>
+        <w:numPr>
+          <w:ilvl w:val="0"/>
+          <w:numId w:val="1003"/>
+        </w:numPr>
+      </w:pPr>
+      <w:r>
+        <w:rPr>
+          <w:b/>
+          <w:bCs/>
+        </w:rPr>
+        <w:t xml:space="preserve">Granularidade temporal.</w:t>
+      </w:r>
+      <w:r>
+        <w:t xml:space="preserve"> </w:t>
+      </w:r>
+      <w:r>
+        <w:t xml:space="preserve">D agrega a temporada inteira, não os 30 dias pré-compra — diluindo o</w:t>
+      </w:r>
+      <w:r>
+        <w:t xml:space="preserve"> </w:t>
+      </w:r>
+      <w:r>
+        <w:t xml:space="preserve">efeito (estimativa conservadora) e impedindo a curva de decaimento θ(Δt) da proposta original.</w:t>
+      </w:r>
+    </w:p>
+    <w:p>
+      <w:pPr>
+        <w:pStyle w:val="Compact"/>
+        <w:numPr>
+          <w:ilvl w:val="0"/>
+          <w:numId w:val="1003"/>
+        </w:numPr>
+      </w:pPr>
+      <w:r>
+        <w:rPr>
+          <w:b/>
+          <w:bCs/>
+        </w:rPr>
+        <w:t xml:space="preserve">C3 (causa comum)</w:t>
+      </w:r>
+      <w:r>
+        <w:t xml:space="preserve"> </w:t>
+      </w:r>
+      <w:r>
+        <w:t xml:space="preserve">não controlado (sem dados de UCL, troca de técnico, receita de TV).</w:t>
+      </w:r>
+    </w:p>
+    <w:p>
+      <w:pPr>
+        <w:pStyle w:val="Compact"/>
+        <w:numPr>
+          <w:ilvl w:val="0"/>
+          <w:numId w:val="1003"/>
+        </w:numPr>
+      </w:pPr>
+      <w:r>
+        <w:rPr>
+          <w:b/>
+          <w:bCs/>
+        </w:rPr>
+        <w:t xml:space="preserve">CATE/IVB via R-learner</w:t>
+      </w:r>
+      <w:r>
+        <w:t xml:space="preserve"> </w:t>
+      </w:r>
+      <w:r>
+        <w:t xml:space="preserve">(econml não instala) — aproximação, tratada como apêndice.</w:t>
+      </w:r>
+    </w:p>
+    <w:p>
+      <w:pPr>
+        <w:pStyle w:val="Compact"/>
+        <w:numPr>
+          <w:ilvl w:val="0"/>
+          <w:numId w:val="1003"/>
+        </w:numPr>
+      </w:pPr>
+      <w:r>
+        <w:rPr>
+          <w:b/>
+          <w:bCs/>
+        </w:rPr>
+        <w:t xml:space="preserve">Não entregues</w:t>
+      </w:r>
+      <w:r>
+        <w:t xml:space="preserve"> </w:t>
+      </w:r>
+      <w:r>
+        <w:t xml:space="preserve">(trabalho futuro): PSM (</w:t>
+      </w:r>
+      <w:r>
+        <w:t xml:space="preserve">“clubes gêmeos”</w:t>
+      </w:r>
+      <w:r>
+        <w:t xml:space="preserve">), integração FBref/StatsBomb,</w:t>
       </w:r>
       <w:r>
         <w:t xml:space="preserve"> </w:t>
@@ -5354,276 +5241,20 @@
         <w:rPr>
           <w:rStyle w:val="VerbatimChar"/>
         </w:rPr>
-        <w:t xml:space="preserve">log_revenue</w:t>
-      </w:r>
-      <w:r>
-        <w:t xml:space="preserve">) e comparar o</w:t>
-      </w:r>
-      <w:r>
-        <w:t xml:space="preserve"> </w:t>
-      </w:r>
-      <w:r>
-        <w:t xml:space="preserve">prêmio médio diretamente, sem o ferramental DML.</w:t>
+        <w:t xml:space="preserve">CausalForestDML</w:t>
+      </w:r>
+      <w:r>
+        <w:t xml:space="preserve">, análise do lado vendedor (</w:t>
+      </w:r>
+      <w:r>
+        <w:t xml:space="preserve">“clubes predadores”</w:t>
+      </w:r>
+      <w:r>
+        <w:t xml:space="preserve">).</w:t>
       </w:r>
     </w:p>
     <w:bookmarkEnd w:id="19"/>
-    <w:bookmarkStart w:id="20" w:name="cronograma-de-implementação"/>
-    <w:p>
-      <w:pPr>
-        <w:pStyle w:val="Heading2"/>
-      </w:pPr>
-      <w:r>
-        <w:t xml:space="preserve">7. Cronograma de implementação</w:t>
-      </w:r>
-    </w:p>
-    <w:tbl>
-      <w:tblPr>
-        <w:tblStyle w:val="Table"/>
-        <w:tblW w:type="pct" w:w="5000"/>
-        <w:tblLayout w:type="fixed"/>
-        <w:tblLook w:firstRow="1" w:lastRow="0" w:firstColumn="0" w:lastColumn="0" w:noHBand="0" w:noVBand="0" w:val="0020"/>
-      </w:tblPr>
-      <w:tblGrid>
-        <w:gridCol w:w="3960"/>
-        <w:gridCol w:w="3960"/>
-      </w:tblGrid>
-      <w:tr>
-        <w:trPr>
-          <w:tblHeader w:val="on"/>
-        </w:trPr>
-        <w:tc>
-          <w:tcPr/>
-          <w:p>
-            <w:pPr>
-              <w:pStyle w:val="Compact"/>
-            </w:pPr>
-            <w:r>
-              <w:t xml:space="preserve">Semana</w:t>
-            </w:r>
-          </w:p>
-        </w:tc>
-        <w:tc>
-          <w:tcPr/>
-          <w:p>
-            <w:pPr>
-              <w:pStyle w:val="Compact"/>
-            </w:pPr>
-            <w:r>
-              <w:t xml:space="preserve">Entrega</w:t>
-            </w:r>
-          </w:p>
-        </w:tc>
-      </w:tr>
-      <w:tr>
-        <w:tc>
-          <w:tcPr/>
-          <w:p>
-            <w:pPr>
-              <w:pStyle w:val="Compact"/>
-            </w:pPr>
-            <w:r>
-              <w:t xml:space="preserve">1</w:t>
-            </w:r>
-          </w:p>
-        </w:tc>
-        <w:tc>
-          <w:tcPr/>
-          <w:p>
-            <w:pPr>
-              <w:pStyle w:val="Compact"/>
-            </w:pPr>
-            <w:r>
-              <w:t xml:space="preserve">Pipeline DML completo (LinearDML + CausalForestDML), análises de robustez 1 e 3</w:t>
-            </w:r>
-          </w:p>
-        </w:tc>
-      </w:tr>
-      <w:tr>
-        <w:tc>
-          <w:tcPr/>
-          <w:p>
-            <w:pPr>
-              <w:pStyle w:val="Compact"/>
-            </w:pPr>
-            <w:r>
-              <w:t xml:space="preserve">2</w:t>
-            </w:r>
-          </w:p>
-        </w:tc>
-        <w:tc>
-          <w:tcPr/>
-          <w:p>
-            <w:pPr>
-              <w:pStyle w:val="Compact"/>
-            </w:pPr>
-            <w:r>
-              <w:t xml:space="preserve">Cálculo de IVB por clube; ranking de clubes-presa e clubes-predadores</w:t>
-            </w:r>
-          </w:p>
-        </w:tc>
-      </w:tr>
-      <w:tr>
-        <w:tc>
-          <w:tcPr/>
-          <w:p>
-            <w:pPr>
-              <w:pStyle w:val="Compact"/>
-            </w:pPr>
-            <w:r>
-              <w:t xml:space="preserve">2</w:t>
-            </w:r>
-          </w:p>
-        </w:tc>
-        <w:tc>
-          <w:tcPr/>
-          <w:p>
-            <w:pPr>
-              <w:pStyle w:val="Compact"/>
-            </w:pPr>
-            <w:r>
-              <w:t xml:space="preserve">Curva</w:t>
-            </w:r>
-            <w:r>
-              <w:t xml:space="preserve"> </w:t>
-            </w:r>
-            <m:oMath>
-              <m:sSub>
-                <m:e>
-                  <m:r>
-                    <m:t>θ</m:t>
-                  </m:r>
-                </m:e>
-                <m:sub>
-                  <m:r>
-                    <m:t>t</m:t>
-                  </m:r>
-                </m:sub>
-              </m:sSub>
-            </m:oMath>
-            <w:r>
-              <w:t xml:space="preserve"> </w:t>
-            </w:r>
-            <w:r>
-              <w:t xml:space="preserve">por temporada + sensibilidade ao PageRank</w:t>
-            </w:r>
-          </w:p>
-        </w:tc>
-      </w:tr>
-      <w:tr>
-        <w:tc>
-          <w:tcPr/>
-          <w:p>
-            <w:pPr>
-              <w:pStyle w:val="Compact"/>
-            </w:pPr>
-            <w:r>
-              <w:t xml:space="preserve">3</w:t>
-            </w:r>
-          </w:p>
-        </w:tc>
-        <w:tc>
-          <w:tcPr/>
-          <w:p>
-            <w:pPr>
-              <w:pStyle w:val="Compact"/>
-            </w:pPr>
-            <w:r>
-              <w:t xml:space="preserve">Validação por PSM e roadmap de enriquecimento (data exata, performance)</w:t>
-            </w:r>
-          </w:p>
-        </w:tc>
-      </w:tr>
-    </w:tbl>
     <w:bookmarkEnd w:id="20"/>
-    <w:bookmarkStart w:id="21" w:name="limitações-reconhecidas"/>
-    <w:p>
-      <w:pPr>
-        <w:pStyle w:val="Heading2"/>
-      </w:pPr>
-      <w:r>
-        <w:t xml:space="preserve">8. Limitações reconhecidas</w:t>
-      </w:r>
-    </w:p>
-    <w:p>
-      <w:pPr>
-        <w:pStyle w:val="FirstParagraph"/>
-      </w:pPr>
-      <w:r>
-        <w:t xml:space="preserve">A modelagem atual não controla por contexto esportivo individual</w:t>
-      </w:r>
-      <w:r>
-        <w:t xml:space="preserve"> </w:t>
-      </w:r>
-      <w:r>
-        <w:t xml:space="preserve">(classificação para a UCL, troca de técnico, choques de receita de TV) nem</w:t>
-      </w:r>
-      <w:r>
-        <w:t xml:space="preserve"> </w:t>
-      </w:r>
-      <w:r>
-        <w:t xml:space="preserve">isola transferências motivadas por cláusula de multa rescisória. Esses</w:t>
-      </w:r>
-      <w:r>
-        <w:t xml:space="preserve"> </w:t>
-      </w:r>
-      <w:r>
-        <w:t xml:space="preserve">elementos correspondem aos confundidores C2 e C3 e ficam endereçados como</w:t>
-      </w:r>
-      <w:r>
-        <w:t xml:space="preserve"> </w:t>
-      </w:r>
-      <w:r>
-        <w:t xml:space="preserve">trabalho futuro. A granularidade temporal trimestral (por temporada) é a</w:t>
-      </w:r>
-      <w:r>
-        <w:t xml:space="preserve"> </w:t>
-      </w:r>
-      <w:r>
-        <w:t xml:space="preserve">restrição mais relevante: ela limita a precisão da estimativa de urgência</w:t>
-      </w:r>
-      <w:r>
-        <w:t xml:space="preserve"> </w:t>
-      </w:r>
-      <w:r>
-        <w:t xml:space="preserve">e impede a estimação direta da curva exponencial de decaimento. Ainda</w:t>
-      </w:r>
-      <w:r>
-        <w:t xml:space="preserve"> </w:t>
-      </w:r>
-      <w:r>
-        <w:t xml:space="preserve">assim, o desenho proposto é suficiente para responder à pergunta principal</w:t>
-      </w:r>
-      <w:r>
-        <w:t xml:space="preserve"> </w:t>
-      </w:r>
-      <w:r>
-        <w:t xml:space="preserve">do projeto —</w:t>
-      </w:r>
-      <w:r>
-        <w:t xml:space="preserve"> </w:t>
-      </w:r>
-      <w:r>
-        <w:rPr>
-          <w:i/>
-          <w:iCs/>
-        </w:rPr>
-        <w:t xml:space="preserve">existe um prêmio causal do vendedor?</w:t>
-      </w:r>
-      <w:r>
-        <w:t xml:space="preserve"> </w:t>
-      </w:r>
-      <w:r>
-        <w:t xml:space="preserve">— com rigor</w:t>
-      </w:r>
-      <w:r>
-        <w:t xml:space="preserve"> </w:t>
-      </w:r>
-      <w:r>
-        <w:t xml:space="preserve">metodológico compatível com o estado da arte.</w:t>
-      </w:r>
-    </w:p>
-    <w:bookmarkEnd w:id="21"/>
-    <w:bookmarkEnd w:id="22"/>
     <w:sectPr>
       <w:footnotePr>
         <w:numRestart w:val="eachSect"/>
@@ -5853,6 +5484,36 @@
     </w:lvlOverride>
   </w:num>
   <w:num w:numId="1002">
+    <w:abstractNumId w:val="99411"/>
+    <w:lvlOverride w:ilvl="0">
+      <w:startOverride w:val="1"/>
+    </w:lvlOverride>
+    <w:lvlOverride w:ilvl="1">
+      <w:startOverride w:val="1"/>
+    </w:lvlOverride>
+    <w:lvlOverride w:ilvl="2">
+      <w:startOverride w:val="1"/>
+    </w:lvlOverride>
+    <w:lvlOverride w:ilvl="3">
+      <w:startOverride w:val="1"/>
+    </w:lvlOverride>
+    <w:lvlOverride w:ilvl="4">
+      <w:startOverride w:val="1"/>
+    </w:lvlOverride>
+    <w:lvlOverride w:ilvl="5">
+      <w:startOverride w:val="1"/>
+    </w:lvlOverride>
+    <w:lvlOverride w:ilvl="6">
+      <w:startOverride w:val="1"/>
+    </w:lvlOverride>
+    <w:lvlOverride w:ilvl="7">
+      <w:startOverride w:val="1"/>
+    </w:lvlOverride>
+    <w:lvlOverride w:ilvl="8">
+      <w:startOverride w:val="1"/>
+    </w:lvlOverride>
+  </w:num>
+  <w:num w:numId="1003">
     <w:abstractNumId w:val="99411"/>
     <w:lvlOverride w:ilvl="0">
       <w:startOverride w:val="1"/>

</xml_diff>